<commit_message>
Add LR4 (monitoring and incident management): report template and guide
The report has Parts 1 and 3, control questions and text tables filled,
yellow fields for measured values and numbered frames for 16 screenshots.
The guide gives step-by-step actions and ready texts for every service;
the Draw.io dashboard is generated by tools/make_dashboard.py.

Co-Authored-By: Claude Opus 5.5 <noreply@anthropic.com>
Claude-Session: https://claude.ai/code/session_01KeeuK4qVpzTPDQXDYVJKg1
</commit_message>
<xml_diff>
--- a/отчёты/Задание 07 Java-методы.docx
+++ b/отчёты/Задание 07 Java-методы.docx
@@ -64,7 +64,7 @@
           </w:tcPr>
           <w:p>
             <w:pPr>
-              <w:spacing w:line="240"/>
+              <w:spacing w:line="240" w:lineRule="auto"/>
             </w:pPr>
             <w:r>
               <w:rPr>
@@ -96,7 +96,7 @@
           </w:tcPr>
           <w:p>
             <w:pPr>
-              <w:spacing w:line="240"/>
+              <w:spacing w:line="240" w:lineRule="auto"/>
             </w:pPr>
             <w:r>
               <w:rPr>
@@ -128,7 +128,7 @@
           </w:tcPr>
           <w:p>
             <w:pPr>
-              <w:spacing w:line="240"/>
+              <w:spacing w:line="240" w:lineRule="auto"/>
             </w:pPr>
             <w:r>
               <w:rPr>
@@ -160,7 +160,7 @@
           </w:tcPr>
           <w:p>
             <w:pPr>
-              <w:spacing w:line="240"/>
+              <w:spacing w:line="240" w:lineRule="auto"/>
             </w:pPr>
             <w:r>
               <w:rPr>
@@ -192,7 +192,7 @@
           </w:tcPr>
           <w:p>
             <w:pPr>
-              <w:spacing w:line="240"/>
+              <w:spacing w:line="240" w:lineRule="auto"/>
             </w:pPr>
             <w:r>
               <w:rPr>
@@ -228,7 +228,7 @@
           </w:tcPr>
           <w:p>
             <w:pPr>
-              <w:spacing w:line="240"/>
+              <w:spacing w:line="240" w:lineRule="auto"/>
             </w:pPr>
             <w:r>
               <w:rPr>
@@ -258,7 +258,7 @@
           </w:tcPr>
           <w:p>
             <w:pPr>
-              <w:spacing w:line="240"/>
+              <w:spacing w:line="240" w:lineRule="auto"/>
             </w:pPr>
             <w:r>
               <w:rPr>
@@ -288,7 +288,7 @@
           </w:tcPr>
           <w:p>
             <w:pPr>
-              <w:spacing w:line="240"/>
+              <w:spacing w:line="240" w:lineRule="auto"/>
             </w:pPr>
             <w:r>
               <w:rPr>
@@ -318,7 +318,7 @@
           </w:tcPr>
           <w:p>
             <w:pPr>
-              <w:spacing w:line="240"/>
+              <w:spacing w:line="240" w:lineRule="auto"/>
             </w:pPr>
             <w:r>
               <w:rPr>
@@ -348,7 +348,7 @@
           </w:tcPr>
           <w:p>
             <w:pPr>
-              <w:spacing w:line="240"/>
+              <w:spacing w:line="240" w:lineRule="auto"/>
             </w:pPr>
             <w:r>
               <w:rPr>
@@ -398,7 +398,7 @@
           </w:tcPr>
           <w:p>
             <w:pPr>
-              <w:spacing w:line="240"/>
+              <w:spacing w:line="240" w:lineRule="auto"/>
             </w:pPr>
             <w:r>
               <w:rPr>
@@ -428,7 +428,7 @@
           </w:tcPr>
           <w:p>
             <w:pPr>
-              <w:spacing w:line="240"/>
+              <w:spacing w:line="240" w:lineRule="auto"/>
             </w:pPr>
             <w:r>
               <w:rPr>
@@ -472,7 +472,7 @@
           </w:tcPr>
           <w:p>
             <w:pPr>
-              <w:spacing w:line="240"/>
+              <w:spacing w:line="240" w:lineRule="auto"/>
             </w:pPr>
             <w:r>
               <w:rPr>
@@ -502,7 +502,7 @@
           </w:tcPr>
           <w:p>
             <w:pPr>
-              <w:spacing w:line="240"/>
+              <w:spacing w:line="240" w:lineRule="auto"/>
             </w:pPr>
             <w:r>
               <w:rPr>
@@ -532,7 +532,7 @@
           </w:tcPr>
           <w:p>
             <w:pPr>
-              <w:spacing w:line="240"/>
+              <w:spacing w:line="240" w:lineRule="auto"/>
             </w:pPr>
             <w:r>
               <w:rPr>
@@ -567,7 +567,7 @@
           </w:tcPr>
           <w:p>
             <w:pPr>
-              <w:spacing w:line="240"/>
+              <w:spacing w:line="240" w:lineRule="auto"/>
             </w:pPr>
             <w:r>
               <w:rPr>
@@ -597,7 +597,7 @@
           </w:tcPr>
           <w:p>
             <w:pPr>
-              <w:spacing w:line="240"/>
+              <w:spacing w:line="240" w:lineRule="auto"/>
             </w:pPr>
             <w:r>
               <w:rPr>
@@ -627,7 +627,7 @@
           </w:tcPr>
           <w:p>
             <w:pPr>
-              <w:spacing w:line="240"/>
+              <w:spacing w:line="240" w:lineRule="auto"/>
             </w:pPr>
             <w:r>
               <w:rPr>
@@ -657,7 +657,7 @@
           </w:tcPr>
           <w:p>
             <w:pPr>
-              <w:spacing w:line="240"/>
+              <w:spacing w:line="240" w:lineRule="auto"/>
             </w:pPr>
             <w:r>
               <w:rPr>
@@ -687,7 +687,7 @@
           </w:tcPr>
           <w:p>
             <w:pPr>
-              <w:spacing w:line="240"/>
+              <w:spacing w:line="240" w:lineRule="auto"/>
             </w:pPr>
             <w:r>
               <w:rPr>
@@ -721,7 +721,7 @@
           </w:tcPr>
           <w:p>
             <w:pPr>
-              <w:spacing w:line="240"/>
+              <w:spacing w:line="240" w:lineRule="auto"/>
             </w:pPr>
             <w:r>
               <w:rPr>
@@ -751,7 +751,7 @@
           </w:tcPr>
           <w:p>
             <w:pPr>
-              <w:spacing w:line="240"/>
+              <w:spacing w:line="240" w:lineRule="auto"/>
             </w:pPr>
             <w:r>
               <w:rPr>
@@ -803,7 +803,7 @@
           </w:tcPr>
           <w:p>
             <w:pPr>
-              <w:spacing w:line="240"/>
+              <w:spacing w:line="240" w:lineRule="auto"/>
             </w:pPr>
             <w:r>
               <w:rPr>
@@ -840,7 +840,7 @@
           </w:tcPr>
           <w:p>
             <w:pPr>
-              <w:spacing w:line="240"/>
+              <w:spacing w:line="240" w:lineRule="auto"/>
             </w:pPr>
             <w:r>
               <w:rPr>
@@ -870,7 +870,7 @@
           </w:tcPr>
           <w:p>
             <w:pPr>
-              <w:spacing w:line="240"/>
+              <w:spacing w:line="240" w:lineRule="auto"/>
             </w:pPr>
             <w:r>
               <w:rPr>
@@ -906,7 +906,8 @@
     </w:p>
     <w:p>
       <w:pPr>
-        <w:spacing w:after="80"/>
+        <w:keepNext w:val="false"/>
+        <w:spacing w:after="80" w:before="0"/>
         <w:ind w:firstLine="709"/>
         <w:jc w:val="both"/>
       </w:pPr>
@@ -956,7 +957,8 @@
     </w:p>
     <w:p>
       <w:pPr>
-        <w:spacing w:after="80"/>
+        <w:keepNext w:val="false"/>
+        <w:spacing w:after="80" w:before="0"/>
         <w:ind w:firstLine="709"/>
         <w:jc w:val="both"/>
       </w:pPr>
@@ -1043,7 +1045,7 @@
           </w:tcPr>
           <w:p>
             <w:pPr>
-              <w:spacing w:line="240"/>
+              <w:spacing w:line="240" w:lineRule="auto"/>
             </w:pPr>
             <w:r>
               <w:rPr>
@@ -1075,7 +1077,7 @@
           </w:tcPr>
           <w:p>
             <w:pPr>
-              <w:spacing w:line="240"/>
+              <w:spacing w:line="240" w:lineRule="auto"/>
             </w:pPr>
             <w:r>
               <w:rPr>
@@ -1107,7 +1109,7 @@
           </w:tcPr>
           <w:p>
             <w:pPr>
-              <w:spacing w:line="240"/>
+              <w:spacing w:line="240" w:lineRule="auto"/>
             </w:pPr>
             <w:r>
               <w:rPr>
@@ -1143,7 +1145,7 @@
           </w:tcPr>
           <w:p>
             <w:pPr>
-              <w:spacing w:line="240"/>
+              <w:spacing w:line="240" w:lineRule="auto"/>
             </w:pPr>
             <w:r>
               <w:rPr>
@@ -1172,7 +1174,7 @@
           </w:tcPr>
           <w:p>
             <w:pPr>
-              <w:spacing w:line="240"/>
+              <w:spacing w:line="240" w:lineRule="auto"/>
             </w:pPr>
             <w:r>
               <w:rPr>
@@ -1231,7 +1233,7 @@
           </w:tcPr>
           <w:p>
             <w:pPr>
-              <w:spacing w:line="240"/>
+              <w:spacing w:line="240" w:lineRule="auto"/>
             </w:pPr>
             <w:r>
               <w:rPr>
@@ -1266,7 +1268,7 @@
           </w:tcPr>
           <w:p>
             <w:pPr>
-              <w:spacing w:line="240"/>
+              <w:spacing w:line="240" w:lineRule="auto"/>
             </w:pPr>
             <w:r>
               <w:rPr>
@@ -1295,7 +1297,7 @@
           </w:tcPr>
           <w:p>
             <w:pPr>
-              <w:spacing w:line="240"/>
+              <w:spacing w:line="240" w:lineRule="auto"/>
             </w:pPr>
             <w:r>
               <w:rPr>
@@ -1332,7 +1334,7 @@
           </w:tcPr>
           <w:p>
             <w:pPr>
-              <w:spacing w:line="240"/>
+              <w:spacing w:line="240" w:lineRule="auto"/>
             </w:pPr>
             <w:r>
               <w:rPr>
@@ -1367,7 +1369,7 @@
           </w:tcPr>
           <w:p>
             <w:pPr>
-              <w:spacing w:line="240"/>
+              <w:spacing w:line="240" w:lineRule="auto"/>
             </w:pPr>
             <w:r>
               <w:rPr>
@@ -1396,7 +1398,7 @@
           </w:tcPr>
           <w:p>
             <w:pPr>
-              <w:spacing w:line="240"/>
+              <w:spacing w:line="240" w:lineRule="auto"/>
             </w:pPr>
             <w:r>
               <w:rPr>
@@ -1441,7 +1443,7 @@
           </w:tcPr>
           <w:p>
             <w:pPr>
-              <w:spacing w:line="240"/>
+              <w:spacing w:line="240" w:lineRule="auto"/>
             </w:pPr>
             <w:r>
               <w:rPr>
@@ -1490,7 +1492,7 @@
           </w:tcPr>
           <w:p>
             <w:pPr>
-              <w:spacing w:line="240"/>
+              <w:spacing w:line="240" w:lineRule="auto"/>
             </w:pPr>
             <w:r>
               <w:rPr>
@@ -1519,7 +1521,7 @@
           </w:tcPr>
           <w:p>
             <w:pPr>
-              <w:spacing w:line="240"/>
+              <w:spacing w:line="240" w:lineRule="auto"/>
             </w:pPr>
             <w:r>
               <w:rPr>
@@ -1586,7 +1588,7 @@
           </w:tcPr>
           <w:p>
             <w:pPr>
-              <w:spacing w:line="240"/>
+              <w:spacing w:line="240" w:lineRule="auto"/>
             </w:pPr>
             <w:r>
               <w:rPr>
@@ -1621,7 +1623,7 @@
           </w:tcPr>
           <w:p>
             <w:pPr>
-              <w:spacing w:line="240"/>
+              <w:spacing w:line="240" w:lineRule="auto"/>
             </w:pPr>
             <w:r>
               <w:rPr>
@@ -1650,7 +1652,7 @@
           </w:tcPr>
           <w:p>
             <w:pPr>
-              <w:spacing w:line="240"/>
+              <w:spacing w:line="240" w:lineRule="auto"/>
             </w:pPr>
             <w:r>
               <w:rPr>
@@ -1732,7 +1734,7 @@
           </w:tcPr>
           <w:p>
             <w:pPr>
-              <w:spacing w:line="240"/>
+              <w:spacing w:line="240" w:lineRule="auto"/>
             </w:pPr>
             <w:r>
               <w:rPr>
@@ -1760,7 +1762,8 @@
     </w:p>
     <w:p>
       <w:pPr>
-        <w:spacing w:after="80"/>
+        <w:keepNext w:val="false"/>
+        <w:spacing w:after="80" w:before="0"/>
         <w:ind w:firstLine="709"/>
         <w:jc w:val="both"/>
       </w:pPr>
@@ -1778,7 +1781,7 @@
           <w:right w:val="single" w:color="BFBFBF" w:sz="4" w:space="4"/>
         </w:pBdr>
         <w:shd w:fill="F4F4F4" w:color="auto" w:val="clear"/>
-        <w:spacing w:after="0" w:before="60" w:line="240"/>
+        <w:spacing w:after="0" w:before="60" w:line="240" w:lineRule="auto"/>
         <w:ind w:left="113" w:right="113"/>
       </w:pPr>
       <w:r>
@@ -1800,7 +1803,7 @@
           <w:right w:val="single" w:color="BFBFBF" w:sz="4" w:space="4"/>
         </w:pBdr>
         <w:shd w:fill="F4F4F4" w:color="auto" w:val="clear"/>
-        <w:spacing w:after="0" w:before="0" w:line="240"/>
+        <w:spacing w:after="0" w:before="0" w:line="240" w:lineRule="auto"/>
         <w:ind w:left="113" w:right="113"/>
       </w:pPr>
       <w:r>
@@ -1822,7 +1825,7 @@
           <w:right w:val="single" w:color="BFBFBF" w:sz="4" w:space="4"/>
         </w:pBdr>
         <w:shd w:fill="F4F4F4" w:color="auto" w:val="clear"/>
-        <w:spacing w:after="0" w:before="0" w:line="240"/>
+        <w:spacing w:after="0" w:before="0" w:line="240" w:lineRule="auto"/>
         <w:ind w:left="113" w:right="113"/>
       </w:pPr>
       <w:r>
@@ -1844,7 +1847,7 @@
           <w:right w:val="single" w:color="BFBFBF" w:sz="4" w:space="4"/>
         </w:pBdr>
         <w:shd w:fill="F4F4F4" w:color="auto" w:val="clear"/>
-        <w:spacing w:after="0" w:before="0" w:line="240"/>
+        <w:spacing w:after="0" w:before="0" w:line="240" w:lineRule="auto"/>
         <w:ind w:left="113" w:right="113"/>
       </w:pPr>
       <w:r>
@@ -1866,7 +1869,7 @@
           <w:right w:val="single" w:color="BFBFBF" w:sz="4" w:space="4"/>
         </w:pBdr>
         <w:shd w:fill="F4F4F4" w:color="auto" w:val="clear"/>
-        <w:spacing w:after="0" w:before="0" w:line="240"/>
+        <w:spacing w:after="0" w:before="0" w:line="240" w:lineRule="auto"/>
         <w:ind w:left="113" w:right="113"/>
       </w:pPr>
       <w:r>
@@ -1888,7 +1891,7 @@
           <w:right w:val="single" w:color="BFBFBF" w:sz="4" w:space="4"/>
         </w:pBdr>
         <w:shd w:fill="F4F4F4" w:color="auto" w:val="clear"/>
-        <w:spacing w:after="0" w:before="0" w:line="240"/>
+        <w:spacing w:after="0" w:before="0" w:line="240" w:lineRule="auto"/>
         <w:ind w:left="113" w:right="113"/>
       </w:pPr>
       <w:r>
@@ -1910,7 +1913,7 @@
           <w:right w:val="single" w:color="BFBFBF" w:sz="4" w:space="4"/>
         </w:pBdr>
         <w:shd w:fill="F4F4F4" w:color="auto" w:val="clear"/>
-        <w:spacing w:after="0" w:before="0" w:line="240"/>
+        <w:spacing w:after="0" w:before="0" w:line="240" w:lineRule="auto"/>
         <w:ind w:left="113" w:right="113"/>
       </w:pPr>
       <w:r>
@@ -1932,7 +1935,7 @@
           <w:right w:val="single" w:color="BFBFBF" w:sz="4" w:space="4"/>
         </w:pBdr>
         <w:shd w:fill="F4F4F4" w:color="auto" w:val="clear"/>
-        <w:spacing w:after="0" w:before="0" w:line="240"/>
+        <w:spacing w:after="0" w:before="0" w:line="240" w:lineRule="auto"/>
         <w:ind w:left="113" w:right="113"/>
       </w:pPr>
       <w:r>
@@ -1954,7 +1957,7 @@
           <w:right w:val="single" w:color="BFBFBF" w:sz="4" w:space="4"/>
         </w:pBdr>
         <w:shd w:fill="F4F4F4" w:color="auto" w:val="clear"/>
-        <w:spacing w:after="0" w:before="0" w:line="240"/>
+        <w:spacing w:after="0" w:before="0" w:line="240" w:lineRule="auto"/>
         <w:ind w:left="113" w:right="113"/>
       </w:pPr>
       <w:r>
@@ -1976,7 +1979,7 @@
           <w:right w:val="single" w:color="BFBFBF" w:sz="4" w:space="4"/>
         </w:pBdr>
         <w:shd w:fill="F4F4F4" w:color="auto" w:val="clear"/>
-        <w:spacing w:after="0" w:before="0" w:line="240"/>
+        <w:spacing w:after="0" w:before="0" w:line="240" w:lineRule="auto"/>
         <w:ind w:left="113" w:right="113"/>
       </w:pPr>
       <w:r>
@@ -1998,7 +2001,7 @@
           <w:right w:val="single" w:color="BFBFBF" w:sz="4" w:space="4"/>
         </w:pBdr>
         <w:shd w:fill="F4F4F4" w:color="auto" w:val="clear"/>
-        <w:spacing w:after="0" w:before="0" w:line="240"/>
+        <w:spacing w:after="0" w:before="0" w:line="240" w:lineRule="auto"/>
         <w:ind w:left="113" w:right="113"/>
       </w:pPr>
       <w:r>
@@ -2020,7 +2023,7 @@
           <w:right w:val="single" w:color="BFBFBF" w:sz="4" w:space="4"/>
         </w:pBdr>
         <w:shd w:fill="F4F4F4" w:color="auto" w:val="clear"/>
-        <w:spacing w:after="0" w:before="0" w:line="240"/>
+        <w:spacing w:after="0" w:before="0" w:line="240" w:lineRule="auto"/>
         <w:ind w:left="113" w:right="113"/>
       </w:pPr>
       <w:r>
@@ -2042,7 +2045,7 @@
           <w:right w:val="single" w:color="BFBFBF" w:sz="4" w:space="4"/>
         </w:pBdr>
         <w:shd w:fill="F4F4F4" w:color="auto" w:val="clear"/>
-        <w:spacing w:after="0" w:before="0" w:line="240"/>
+        <w:spacing w:after="0" w:before="0" w:line="240" w:lineRule="auto"/>
         <w:ind w:left="113" w:right="113"/>
       </w:pPr>
       <w:r>
@@ -2064,7 +2067,7 @@
           <w:right w:val="single" w:color="BFBFBF" w:sz="4" w:space="4"/>
         </w:pBdr>
         <w:shd w:fill="F4F4F4" w:color="auto" w:val="clear"/>
-        <w:spacing w:after="0" w:before="0" w:line="240"/>
+        <w:spacing w:after="0" w:before="0" w:line="240" w:lineRule="auto"/>
         <w:ind w:left="113" w:right="113"/>
       </w:pPr>
       <w:r>
@@ -2086,7 +2089,7 @@
           <w:right w:val="single" w:color="BFBFBF" w:sz="4" w:space="4"/>
         </w:pBdr>
         <w:shd w:fill="F4F4F4" w:color="auto" w:val="clear"/>
-        <w:spacing w:after="0" w:before="0" w:line="240"/>
+        <w:spacing w:after="0" w:before="0" w:line="240" w:lineRule="auto"/>
         <w:ind w:left="113" w:right="113"/>
       </w:pPr>
       <w:r>
@@ -2108,7 +2111,7 @@
           <w:right w:val="single" w:color="BFBFBF" w:sz="4" w:space="4"/>
         </w:pBdr>
         <w:shd w:fill="F4F4F4" w:color="auto" w:val="clear"/>
-        <w:spacing w:after="0" w:before="0" w:line="240"/>
+        <w:spacing w:after="0" w:before="0" w:line="240" w:lineRule="auto"/>
         <w:ind w:left="113" w:right="113"/>
       </w:pPr>
       <w:r>
@@ -2130,7 +2133,7 @@
           <w:right w:val="single" w:color="BFBFBF" w:sz="4" w:space="4"/>
         </w:pBdr>
         <w:shd w:fill="F4F4F4" w:color="auto" w:val="clear"/>
-        <w:spacing w:after="0" w:before="0" w:line="240"/>
+        <w:spacing w:after="0" w:before="0" w:line="240" w:lineRule="auto"/>
         <w:ind w:left="113" w:right="113"/>
       </w:pPr>
       <w:r>
@@ -2152,7 +2155,7 @@
           <w:right w:val="single" w:color="BFBFBF" w:sz="4" w:space="4"/>
         </w:pBdr>
         <w:shd w:fill="F4F4F4" w:color="auto" w:val="clear"/>
-        <w:spacing w:after="0" w:before="0" w:line="240"/>
+        <w:spacing w:after="0" w:before="0" w:line="240" w:lineRule="auto"/>
         <w:ind w:left="113" w:right="113"/>
       </w:pPr>
       <w:r>
@@ -2174,7 +2177,7 @@
           <w:right w:val="single" w:color="BFBFBF" w:sz="4" w:space="4"/>
         </w:pBdr>
         <w:shd w:fill="F4F4F4" w:color="auto" w:val="clear"/>
-        <w:spacing w:after="0" w:before="0" w:line="240"/>
+        <w:spacing w:after="0" w:before="0" w:line="240" w:lineRule="auto"/>
         <w:ind w:left="113" w:right="113"/>
       </w:pPr>
       <w:r>
@@ -2196,7 +2199,7 @@
           <w:right w:val="single" w:color="BFBFBF" w:sz="4" w:space="4"/>
         </w:pBdr>
         <w:shd w:fill="F4F4F4" w:color="auto" w:val="clear"/>
-        <w:spacing w:after="0" w:before="0" w:line="240"/>
+        <w:spacing w:after="0" w:before="0" w:line="240" w:lineRule="auto"/>
         <w:ind w:left="113" w:right="113"/>
       </w:pPr>
       <w:r>
@@ -2218,7 +2221,7 @@
           <w:right w:val="single" w:color="BFBFBF" w:sz="4" w:space="4"/>
         </w:pBdr>
         <w:shd w:fill="F4F4F4" w:color="auto" w:val="clear"/>
-        <w:spacing w:after="0" w:before="0" w:line="240"/>
+        <w:spacing w:after="0" w:before="0" w:line="240" w:lineRule="auto"/>
         <w:ind w:left="113" w:right="113"/>
       </w:pPr>
       <w:r>
@@ -2240,7 +2243,7 @@
           <w:right w:val="single" w:color="BFBFBF" w:sz="4" w:space="4"/>
         </w:pBdr>
         <w:shd w:fill="F4F4F4" w:color="auto" w:val="clear"/>
-        <w:spacing w:after="0" w:before="0" w:line="240"/>
+        <w:spacing w:after="0" w:before="0" w:line="240" w:lineRule="auto"/>
         <w:ind w:left="113" w:right="113"/>
       </w:pPr>
       <w:r>
@@ -2262,7 +2265,7 @@
           <w:right w:val="single" w:color="BFBFBF" w:sz="4" w:space="4"/>
         </w:pBdr>
         <w:shd w:fill="F4F4F4" w:color="auto" w:val="clear"/>
-        <w:spacing w:after="0" w:before="0" w:line="240"/>
+        <w:spacing w:after="0" w:before="0" w:line="240" w:lineRule="auto"/>
         <w:ind w:left="113" w:right="113"/>
       </w:pPr>
       <w:r>
@@ -2284,7 +2287,7 @@
           <w:right w:val="single" w:color="BFBFBF" w:sz="4" w:space="4"/>
         </w:pBdr>
         <w:shd w:fill="F4F4F4" w:color="auto" w:val="clear"/>
-        <w:spacing w:after="0" w:before="0" w:line="240"/>
+        <w:spacing w:after="0" w:before="0" w:line="240" w:lineRule="auto"/>
         <w:ind w:left="113" w:right="113"/>
       </w:pPr>
       <w:r>
@@ -2306,7 +2309,7 @@
           <w:right w:val="single" w:color="BFBFBF" w:sz="4" w:space="4"/>
         </w:pBdr>
         <w:shd w:fill="F4F4F4" w:color="auto" w:val="clear"/>
-        <w:spacing w:after="160" w:before="0" w:line="240"/>
+        <w:spacing w:after="160" w:before="0" w:line="240" w:lineRule="auto"/>
         <w:ind w:left="113" w:right="113"/>
       </w:pPr>
       <w:r>
@@ -2320,7 +2323,8 @@
     </w:p>
     <w:p>
       <w:pPr>
-        <w:spacing w:after="80"/>
+        <w:keepNext w:val="false"/>
+        <w:spacing w:after="80" w:before="0"/>
         <w:ind w:firstLine="709"/>
         <w:jc w:val="both"/>
       </w:pPr>
@@ -2349,7 +2353,7 @@
           <w:right w:val="single" w:color="BFBFBF" w:sz="4" w:space="4"/>
         </w:pBdr>
         <w:shd w:fill="F4F4F4" w:color="auto" w:val="clear"/>
-        <w:spacing w:after="0" w:before="60" w:line="240"/>
+        <w:spacing w:after="0" w:before="60" w:line="240" w:lineRule="auto"/>
         <w:ind w:left="113" w:right="113"/>
       </w:pPr>
       <w:r>
@@ -2371,7 +2375,7 @@
           <w:right w:val="single" w:color="BFBFBF" w:sz="4" w:space="4"/>
         </w:pBdr>
         <w:shd w:fill="F4F4F4" w:color="auto" w:val="clear"/>
-        <w:spacing w:after="0" w:before="0" w:line="240"/>
+        <w:spacing w:after="0" w:before="0" w:line="240" w:lineRule="auto"/>
         <w:ind w:left="113" w:right="113"/>
       </w:pPr>
       <w:r>
@@ -2393,7 +2397,7 @@
           <w:right w:val="single" w:color="BFBFBF" w:sz="4" w:space="4"/>
         </w:pBdr>
         <w:shd w:fill="F4F4F4" w:color="auto" w:val="clear"/>
-        <w:spacing w:after="0" w:before="0" w:line="240"/>
+        <w:spacing w:after="0" w:before="0" w:line="240" w:lineRule="auto"/>
         <w:ind w:left="113" w:right="113"/>
       </w:pPr>
       <w:r>
@@ -2415,7 +2419,7 @@
           <w:right w:val="single" w:color="BFBFBF" w:sz="4" w:space="4"/>
         </w:pBdr>
         <w:shd w:fill="F4F4F4" w:color="auto" w:val="clear"/>
-        <w:spacing w:after="0" w:before="0" w:line="240"/>
+        <w:spacing w:after="0" w:before="0" w:line="240" w:lineRule="auto"/>
         <w:ind w:left="113" w:right="113"/>
       </w:pPr>
       <w:r>
@@ -2437,7 +2441,7 @@
           <w:right w:val="single" w:color="BFBFBF" w:sz="4" w:space="4"/>
         </w:pBdr>
         <w:shd w:fill="F4F4F4" w:color="auto" w:val="clear"/>
-        <w:spacing w:after="160" w:before="0" w:line="240"/>
+        <w:spacing w:after="160" w:before="0" w:line="240" w:lineRule="auto"/>
         <w:ind w:left="113" w:right="113"/>
       </w:pPr>
       <w:r>
@@ -2469,7 +2473,7 @@
           <w:right w:val="single" w:color="BFBFBF" w:sz="4" w:space="4"/>
         </w:pBdr>
         <w:shd w:fill="F4F4F4" w:color="auto" w:val="clear"/>
-        <w:spacing w:after="0" w:before="60" w:line="240"/>
+        <w:spacing w:after="0" w:before="60" w:line="240" w:lineRule="auto"/>
         <w:ind w:left="113" w:right="113"/>
       </w:pPr>
       <w:r>
@@ -2491,7 +2495,7 @@
           <w:right w:val="single" w:color="BFBFBF" w:sz="4" w:space="4"/>
         </w:pBdr>
         <w:shd w:fill="F4F4F4" w:color="auto" w:val="clear"/>
-        <w:spacing w:after="0" w:before="0" w:line="240"/>
+        <w:spacing w:after="0" w:before="0" w:line="240" w:lineRule="auto"/>
         <w:ind w:left="113" w:right="113"/>
       </w:pPr>
       <w:r>
@@ -2513,7 +2517,7 @@
           <w:right w:val="single" w:color="BFBFBF" w:sz="4" w:space="4"/>
         </w:pBdr>
         <w:shd w:fill="F4F4F4" w:color="auto" w:val="clear"/>
-        <w:spacing w:after="0" w:before="0" w:line="240"/>
+        <w:spacing w:after="0" w:before="0" w:line="240" w:lineRule="auto"/>
         <w:ind w:left="113" w:right="113"/>
       </w:pPr>
       <w:r>
@@ -2535,7 +2539,7 @@
           <w:right w:val="single" w:color="BFBFBF" w:sz="4" w:space="4"/>
         </w:pBdr>
         <w:shd w:fill="F4F4F4" w:color="auto" w:val="clear"/>
-        <w:spacing w:after="0" w:before="0" w:line="240"/>
+        <w:spacing w:after="0" w:before="0" w:line="240" w:lineRule="auto"/>
         <w:ind w:left="113" w:right="113"/>
       </w:pPr>
       <w:r>
@@ -2557,7 +2561,7 @@
           <w:right w:val="single" w:color="BFBFBF" w:sz="4" w:space="4"/>
         </w:pBdr>
         <w:shd w:fill="F4F4F4" w:color="auto" w:val="clear"/>
-        <w:spacing w:after="0" w:before="0" w:line="240"/>
+        <w:spacing w:after="0" w:before="0" w:line="240" w:lineRule="auto"/>
         <w:ind w:left="113" w:right="113"/>
       </w:pPr>
       <w:r>
@@ -2579,7 +2583,7 @@
           <w:right w:val="single" w:color="BFBFBF" w:sz="4" w:space="4"/>
         </w:pBdr>
         <w:shd w:fill="F4F4F4" w:color="auto" w:val="clear"/>
-        <w:spacing w:after="0" w:before="0" w:line="240"/>
+        <w:spacing w:after="0" w:before="0" w:line="240" w:lineRule="auto"/>
         <w:ind w:left="113" w:right="113"/>
       </w:pPr>
       <w:r>
@@ -2601,7 +2605,7 @@
           <w:right w:val="single" w:color="BFBFBF" w:sz="4" w:space="4"/>
         </w:pBdr>
         <w:shd w:fill="F4F4F4" w:color="auto" w:val="clear"/>
-        <w:spacing w:after="0" w:before="0" w:line="240"/>
+        <w:spacing w:after="0" w:before="0" w:line="240" w:lineRule="auto"/>
         <w:ind w:left="113" w:right="113"/>
       </w:pPr>
       <w:r>
@@ -2623,7 +2627,7 @@
           <w:right w:val="single" w:color="BFBFBF" w:sz="4" w:space="4"/>
         </w:pBdr>
         <w:shd w:fill="F4F4F4" w:color="auto" w:val="clear"/>
-        <w:spacing w:after="0" w:before="0" w:line="240"/>
+        <w:spacing w:after="0" w:before="0" w:line="240" w:lineRule="auto"/>
         <w:ind w:left="113" w:right="113"/>
       </w:pPr>
       <w:r>
@@ -2645,7 +2649,7 @@
           <w:right w:val="single" w:color="BFBFBF" w:sz="4" w:space="4"/>
         </w:pBdr>
         <w:shd w:fill="F4F4F4" w:color="auto" w:val="clear"/>
-        <w:spacing w:after="0" w:before="0" w:line="240"/>
+        <w:spacing w:after="0" w:before="0" w:line="240" w:lineRule="auto"/>
         <w:ind w:left="113" w:right="113"/>
       </w:pPr>
       <w:r>
@@ -2667,7 +2671,7 @@
           <w:right w:val="single" w:color="BFBFBF" w:sz="4" w:space="4"/>
         </w:pBdr>
         <w:shd w:fill="F4F4F4" w:color="auto" w:val="clear"/>
-        <w:spacing w:after="0" w:before="0" w:line="240"/>
+        <w:spacing w:after="0" w:before="0" w:line="240" w:lineRule="auto"/>
         <w:ind w:left="113" w:right="113"/>
       </w:pPr>
       <w:r>
@@ -2689,7 +2693,7 @@
           <w:right w:val="single" w:color="BFBFBF" w:sz="4" w:space="4"/>
         </w:pBdr>
         <w:shd w:fill="F4F4F4" w:color="auto" w:val="clear"/>
-        <w:spacing w:after="0" w:before="0" w:line="240"/>
+        <w:spacing w:after="0" w:before="0" w:line="240" w:lineRule="auto"/>
         <w:ind w:left="113" w:right="113"/>
       </w:pPr>
       <w:r>
@@ -2711,7 +2715,7 @@
           <w:right w:val="single" w:color="BFBFBF" w:sz="4" w:space="4"/>
         </w:pBdr>
         <w:shd w:fill="F4F4F4" w:color="auto" w:val="clear"/>
-        <w:spacing w:after="0" w:before="0" w:line="240"/>
+        <w:spacing w:after="0" w:before="0" w:line="240" w:lineRule="auto"/>
         <w:ind w:left="113" w:right="113"/>
       </w:pPr>
       <w:r>
@@ -2733,7 +2737,7 @@
           <w:right w:val="single" w:color="BFBFBF" w:sz="4" w:space="4"/>
         </w:pBdr>
         <w:shd w:fill="F4F4F4" w:color="auto" w:val="clear"/>
-        <w:spacing w:after="0" w:before="0" w:line="240"/>
+        <w:spacing w:after="0" w:before="0" w:line="240" w:lineRule="auto"/>
         <w:ind w:left="113" w:right="113"/>
       </w:pPr>
       <w:r>
@@ -2755,7 +2759,7 @@
           <w:right w:val="single" w:color="BFBFBF" w:sz="4" w:space="4"/>
         </w:pBdr>
         <w:shd w:fill="F4F4F4" w:color="auto" w:val="clear"/>
-        <w:spacing w:after="0" w:before="0" w:line="240"/>
+        <w:spacing w:after="0" w:before="0" w:line="240" w:lineRule="auto"/>
         <w:ind w:left="113" w:right="113"/>
       </w:pPr>
       <w:r>
@@ -2777,7 +2781,7 @@
           <w:right w:val="single" w:color="BFBFBF" w:sz="4" w:space="4"/>
         </w:pBdr>
         <w:shd w:fill="F4F4F4" w:color="auto" w:val="clear"/>
-        <w:spacing w:after="0" w:before="0" w:line="240"/>
+        <w:spacing w:after="0" w:before="0" w:line="240" w:lineRule="auto"/>
         <w:ind w:left="113" w:right="113"/>
       </w:pPr>
       <w:r>
@@ -2799,7 +2803,7 @@
           <w:right w:val="single" w:color="BFBFBF" w:sz="4" w:space="4"/>
         </w:pBdr>
         <w:shd w:fill="F4F4F4" w:color="auto" w:val="clear"/>
-        <w:spacing w:after="0" w:before="0" w:line="240"/>
+        <w:spacing w:after="0" w:before="0" w:line="240" w:lineRule="auto"/>
         <w:ind w:left="113" w:right="113"/>
       </w:pPr>
       <w:r>
@@ -2821,7 +2825,7 @@
           <w:right w:val="single" w:color="BFBFBF" w:sz="4" w:space="4"/>
         </w:pBdr>
         <w:shd w:fill="F4F4F4" w:color="auto" w:val="clear"/>
-        <w:spacing w:after="0" w:before="0" w:line="240"/>
+        <w:spacing w:after="0" w:before="0" w:line="240" w:lineRule="auto"/>
         <w:ind w:left="113" w:right="113"/>
       </w:pPr>
       <w:r>
@@ -2843,7 +2847,7 @@
           <w:right w:val="single" w:color="BFBFBF" w:sz="4" w:space="4"/>
         </w:pBdr>
         <w:shd w:fill="F4F4F4" w:color="auto" w:val="clear"/>
-        <w:spacing w:after="0" w:before="0" w:line="240"/>
+        <w:spacing w:after="0" w:before="0" w:line="240" w:lineRule="auto"/>
         <w:ind w:left="113" w:right="113"/>
       </w:pPr>
       <w:r>
@@ -2865,7 +2869,7 @@
           <w:right w:val="single" w:color="BFBFBF" w:sz="4" w:space="4"/>
         </w:pBdr>
         <w:shd w:fill="F4F4F4" w:color="auto" w:val="clear"/>
-        <w:spacing w:after="0" w:before="0" w:line="240"/>
+        <w:spacing w:after="0" w:before="0" w:line="240" w:lineRule="auto"/>
         <w:ind w:left="113" w:right="113"/>
       </w:pPr>
       <w:r>
@@ -2887,7 +2891,7 @@
           <w:right w:val="single" w:color="BFBFBF" w:sz="4" w:space="4"/>
         </w:pBdr>
         <w:shd w:fill="F4F4F4" w:color="auto" w:val="clear"/>
-        <w:spacing w:after="0" w:before="0" w:line="240"/>
+        <w:spacing w:after="0" w:before="0" w:line="240" w:lineRule="auto"/>
         <w:ind w:left="113" w:right="113"/>
       </w:pPr>
       <w:r>
@@ -2909,7 +2913,7 @@
           <w:right w:val="single" w:color="BFBFBF" w:sz="4" w:space="4"/>
         </w:pBdr>
         <w:shd w:fill="F4F4F4" w:color="auto" w:val="clear"/>
-        <w:spacing w:after="0" w:before="0" w:line="240"/>
+        <w:spacing w:after="0" w:before="0" w:line="240" w:lineRule="auto"/>
         <w:ind w:left="113" w:right="113"/>
       </w:pPr>
       <w:r>
@@ -2931,7 +2935,7 @@
           <w:right w:val="single" w:color="BFBFBF" w:sz="4" w:space="4"/>
         </w:pBdr>
         <w:shd w:fill="F4F4F4" w:color="auto" w:val="clear"/>
-        <w:spacing w:after="0" w:before="0" w:line="240"/>
+        <w:spacing w:after="0" w:before="0" w:line="240" w:lineRule="auto"/>
         <w:ind w:left="113" w:right="113"/>
       </w:pPr>
       <w:r>
@@ -2953,7 +2957,7 @@
           <w:right w:val="single" w:color="BFBFBF" w:sz="4" w:space="4"/>
         </w:pBdr>
         <w:shd w:fill="F4F4F4" w:color="auto" w:val="clear"/>
-        <w:spacing w:after="0" w:before="0" w:line="240"/>
+        <w:spacing w:after="0" w:before="0" w:line="240" w:lineRule="auto"/>
         <w:ind w:left="113" w:right="113"/>
       </w:pPr>
       <w:r>
@@ -2975,7 +2979,7 @@
           <w:right w:val="single" w:color="BFBFBF" w:sz="4" w:space="4"/>
         </w:pBdr>
         <w:shd w:fill="F4F4F4" w:color="auto" w:val="clear"/>
-        <w:spacing w:after="0" w:before="0" w:line="240"/>
+        <w:spacing w:after="0" w:before="0" w:line="240" w:lineRule="auto"/>
         <w:ind w:left="113" w:right="113"/>
       </w:pPr>
       <w:r>
@@ -2997,7 +3001,7 @@
           <w:right w:val="single" w:color="BFBFBF" w:sz="4" w:space="4"/>
         </w:pBdr>
         <w:shd w:fill="F4F4F4" w:color="auto" w:val="clear"/>
-        <w:spacing w:after="0" w:before="0" w:line="240"/>
+        <w:spacing w:after="0" w:before="0" w:line="240" w:lineRule="auto"/>
         <w:ind w:left="113" w:right="113"/>
       </w:pPr>
       <w:r>
@@ -3019,7 +3023,7 @@
           <w:right w:val="single" w:color="BFBFBF" w:sz="4" w:space="4"/>
         </w:pBdr>
         <w:shd w:fill="F4F4F4" w:color="auto" w:val="clear"/>
-        <w:spacing w:after="0" w:before="0" w:line="240"/>
+        <w:spacing w:after="0" w:before="0" w:line="240" w:lineRule="auto"/>
         <w:ind w:left="113" w:right="113"/>
       </w:pPr>
       <w:r>
@@ -3041,7 +3045,7 @@
           <w:right w:val="single" w:color="BFBFBF" w:sz="4" w:space="4"/>
         </w:pBdr>
         <w:shd w:fill="F4F4F4" w:color="auto" w:val="clear"/>
-        <w:spacing w:after="0" w:before="0" w:line="240"/>
+        <w:spacing w:after="0" w:before="0" w:line="240" w:lineRule="auto"/>
         <w:ind w:left="113" w:right="113"/>
       </w:pPr>
       <w:r>
@@ -3063,7 +3067,7 @@
           <w:right w:val="single" w:color="BFBFBF" w:sz="4" w:space="4"/>
         </w:pBdr>
         <w:shd w:fill="F4F4F4" w:color="auto" w:val="clear"/>
-        <w:spacing w:after="0" w:before="0" w:line="240"/>
+        <w:spacing w:after="0" w:before="0" w:line="240" w:lineRule="auto"/>
         <w:ind w:left="113" w:right="113"/>
       </w:pPr>
       <w:r>
@@ -3085,7 +3089,7 @@
           <w:right w:val="single" w:color="BFBFBF" w:sz="4" w:space="4"/>
         </w:pBdr>
         <w:shd w:fill="F4F4F4" w:color="auto" w:val="clear"/>
-        <w:spacing w:after="0" w:before="0" w:line="240"/>
+        <w:spacing w:after="0" w:before="0" w:line="240" w:lineRule="auto"/>
         <w:ind w:left="113" w:right="113"/>
       </w:pPr>
       <w:r>
@@ -3107,7 +3111,7 @@
           <w:right w:val="single" w:color="BFBFBF" w:sz="4" w:space="4"/>
         </w:pBdr>
         <w:shd w:fill="F4F4F4" w:color="auto" w:val="clear"/>
-        <w:spacing w:after="0" w:before="0" w:line="240"/>
+        <w:spacing w:after="0" w:before="0" w:line="240" w:lineRule="auto"/>
         <w:ind w:left="113" w:right="113"/>
       </w:pPr>
       <w:r>
@@ -3129,7 +3133,7 @@
           <w:right w:val="single" w:color="BFBFBF" w:sz="4" w:space="4"/>
         </w:pBdr>
         <w:shd w:fill="F4F4F4" w:color="auto" w:val="clear"/>
-        <w:spacing w:after="0" w:before="0" w:line="240"/>
+        <w:spacing w:after="0" w:before="0" w:line="240" w:lineRule="auto"/>
         <w:ind w:left="113" w:right="113"/>
       </w:pPr>
       <w:r>
@@ -3151,7 +3155,7 @@
           <w:right w:val="single" w:color="BFBFBF" w:sz="4" w:space="4"/>
         </w:pBdr>
         <w:shd w:fill="F4F4F4" w:color="auto" w:val="clear"/>
-        <w:spacing w:after="0" w:before="0" w:line="240"/>
+        <w:spacing w:after="0" w:before="0" w:line="240" w:lineRule="auto"/>
         <w:ind w:left="113" w:right="113"/>
       </w:pPr>
       <w:r>
@@ -3173,7 +3177,7 @@
           <w:right w:val="single" w:color="BFBFBF" w:sz="4" w:space="4"/>
         </w:pBdr>
         <w:shd w:fill="F4F4F4" w:color="auto" w:val="clear"/>
-        <w:spacing w:after="0" w:before="0" w:line="240"/>
+        <w:spacing w:after="0" w:before="0" w:line="240" w:lineRule="auto"/>
         <w:ind w:left="113" w:right="113"/>
       </w:pPr>
       <w:r>
@@ -3195,7 +3199,7 @@
           <w:right w:val="single" w:color="BFBFBF" w:sz="4" w:space="4"/>
         </w:pBdr>
         <w:shd w:fill="F4F4F4" w:color="auto" w:val="clear"/>
-        <w:spacing w:after="0" w:before="0" w:line="240"/>
+        <w:spacing w:after="0" w:before="0" w:line="240" w:lineRule="auto"/>
         <w:ind w:left="113" w:right="113"/>
       </w:pPr>
       <w:r>
@@ -3217,7 +3221,7 @@
           <w:right w:val="single" w:color="BFBFBF" w:sz="4" w:space="4"/>
         </w:pBdr>
         <w:shd w:fill="F4F4F4" w:color="auto" w:val="clear"/>
-        <w:spacing w:after="0" w:before="0" w:line="240"/>
+        <w:spacing w:after="0" w:before="0" w:line="240" w:lineRule="auto"/>
         <w:ind w:left="113" w:right="113"/>
       </w:pPr>
       <w:r>
@@ -3239,7 +3243,7 @@
           <w:right w:val="single" w:color="BFBFBF" w:sz="4" w:space="4"/>
         </w:pBdr>
         <w:shd w:fill="F4F4F4" w:color="auto" w:val="clear"/>
-        <w:spacing w:after="0" w:before="0" w:line="240"/>
+        <w:spacing w:after="0" w:before="0" w:line="240" w:lineRule="auto"/>
         <w:ind w:left="113" w:right="113"/>
       </w:pPr>
       <w:r>
@@ -3261,7 +3265,7 @@
           <w:right w:val="single" w:color="BFBFBF" w:sz="4" w:space="4"/>
         </w:pBdr>
         <w:shd w:fill="F4F4F4" w:color="auto" w:val="clear"/>
-        <w:spacing w:after="0" w:before="0" w:line="240"/>
+        <w:spacing w:after="0" w:before="0" w:line="240" w:lineRule="auto"/>
         <w:ind w:left="113" w:right="113"/>
       </w:pPr>
       <w:r>
@@ -3283,7 +3287,7 @@
           <w:right w:val="single" w:color="BFBFBF" w:sz="4" w:space="4"/>
         </w:pBdr>
         <w:shd w:fill="F4F4F4" w:color="auto" w:val="clear"/>
-        <w:spacing w:after="0" w:before="0" w:line="240"/>
+        <w:spacing w:after="0" w:before="0" w:line="240" w:lineRule="auto"/>
         <w:ind w:left="113" w:right="113"/>
       </w:pPr>
       <w:r>
@@ -3305,7 +3309,7 @@
           <w:right w:val="single" w:color="BFBFBF" w:sz="4" w:space="4"/>
         </w:pBdr>
         <w:shd w:fill="F4F4F4" w:color="auto" w:val="clear"/>
-        <w:spacing w:after="0" w:before="0" w:line="240"/>
+        <w:spacing w:after="0" w:before="0" w:line="240" w:lineRule="auto"/>
         <w:ind w:left="113" w:right="113"/>
       </w:pPr>
       <w:r>
@@ -3327,7 +3331,7 @@
           <w:right w:val="single" w:color="BFBFBF" w:sz="4" w:space="4"/>
         </w:pBdr>
         <w:shd w:fill="F4F4F4" w:color="auto" w:val="clear"/>
-        <w:spacing w:after="0" w:before="0" w:line="240"/>
+        <w:spacing w:after="0" w:before="0" w:line="240" w:lineRule="auto"/>
         <w:ind w:left="113" w:right="113"/>
       </w:pPr>
       <w:r>
@@ -3349,7 +3353,7 @@
           <w:right w:val="single" w:color="BFBFBF" w:sz="4" w:space="4"/>
         </w:pBdr>
         <w:shd w:fill="F4F4F4" w:color="auto" w:val="clear"/>
-        <w:spacing w:after="0" w:before="0" w:line="240"/>
+        <w:spacing w:after="0" w:before="0" w:line="240" w:lineRule="auto"/>
         <w:ind w:left="113" w:right="113"/>
       </w:pPr>
       <w:r>
@@ -3371,7 +3375,7 @@
           <w:right w:val="single" w:color="BFBFBF" w:sz="4" w:space="4"/>
         </w:pBdr>
         <w:shd w:fill="F4F4F4" w:color="auto" w:val="clear"/>
-        <w:spacing w:after="0" w:before="0" w:line="240"/>
+        <w:spacing w:after="0" w:before="0" w:line="240" w:lineRule="auto"/>
         <w:ind w:left="113" w:right="113"/>
       </w:pPr>
       <w:r>
@@ -3393,7 +3397,7 @@
           <w:right w:val="single" w:color="BFBFBF" w:sz="4" w:space="4"/>
         </w:pBdr>
         <w:shd w:fill="F4F4F4" w:color="auto" w:val="clear"/>
-        <w:spacing w:after="0" w:before="0" w:line="240"/>
+        <w:spacing w:after="0" w:before="0" w:line="240" w:lineRule="auto"/>
         <w:ind w:left="113" w:right="113"/>
       </w:pPr>
       <w:r>
@@ -3415,7 +3419,7 @@
           <w:right w:val="single" w:color="BFBFBF" w:sz="4" w:space="4"/>
         </w:pBdr>
         <w:shd w:fill="F4F4F4" w:color="auto" w:val="clear"/>
-        <w:spacing w:after="0" w:before="0" w:line="240"/>
+        <w:spacing w:after="0" w:before="0" w:line="240" w:lineRule="auto"/>
         <w:ind w:left="113" w:right="113"/>
       </w:pPr>
       <w:r>
@@ -3437,7 +3441,7 @@
           <w:right w:val="single" w:color="BFBFBF" w:sz="4" w:space="4"/>
         </w:pBdr>
         <w:shd w:fill="F4F4F4" w:color="auto" w:val="clear"/>
-        <w:spacing w:after="0" w:before="0" w:line="240"/>
+        <w:spacing w:after="0" w:before="0" w:line="240" w:lineRule="auto"/>
         <w:ind w:left="113" w:right="113"/>
       </w:pPr>
       <w:r>
@@ -3459,7 +3463,7 @@
           <w:right w:val="single" w:color="BFBFBF" w:sz="4" w:space="4"/>
         </w:pBdr>
         <w:shd w:fill="F4F4F4" w:color="auto" w:val="clear"/>
-        <w:spacing w:after="0" w:before="0" w:line="240"/>
+        <w:spacing w:after="0" w:before="0" w:line="240" w:lineRule="auto"/>
         <w:ind w:left="113" w:right="113"/>
       </w:pPr>
       <w:r>
@@ -3481,7 +3485,7 @@
           <w:right w:val="single" w:color="BFBFBF" w:sz="4" w:space="4"/>
         </w:pBdr>
         <w:shd w:fill="F4F4F4" w:color="auto" w:val="clear"/>
-        <w:spacing w:after="0" w:before="0" w:line="240"/>
+        <w:spacing w:after="0" w:before="0" w:line="240" w:lineRule="auto"/>
         <w:ind w:left="113" w:right="113"/>
       </w:pPr>
       <w:r>
@@ -3503,7 +3507,7 @@
           <w:right w:val="single" w:color="BFBFBF" w:sz="4" w:space="4"/>
         </w:pBdr>
         <w:shd w:fill="F4F4F4" w:color="auto" w:val="clear"/>
-        <w:spacing w:after="0" w:before="0" w:line="240"/>
+        <w:spacing w:after="0" w:before="0" w:line="240" w:lineRule="auto"/>
         <w:ind w:left="113" w:right="113"/>
       </w:pPr>
       <w:r>
@@ -3525,7 +3529,7 @@
           <w:right w:val="single" w:color="BFBFBF" w:sz="4" w:space="4"/>
         </w:pBdr>
         <w:shd w:fill="F4F4F4" w:color="auto" w:val="clear"/>
-        <w:spacing w:after="0" w:before="0" w:line="240"/>
+        <w:spacing w:after="0" w:before="0" w:line="240" w:lineRule="auto"/>
         <w:ind w:left="113" w:right="113"/>
       </w:pPr>
       <w:r>
@@ -3547,7 +3551,7 @@
           <w:right w:val="single" w:color="BFBFBF" w:sz="4" w:space="4"/>
         </w:pBdr>
         <w:shd w:fill="F4F4F4" w:color="auto" w:val="clear"/>
-        <w:spacing w:after="0" w:before="0" w:line="240"/>
+        <w:spacing w:after="0" w:before="0" w:line="240" w:lineRule="auto"/>
         <w:ind w:left="113" w:right="113"/>
       </w:pPr>
       <w:r>
@@ -3569,7 +3573,7 @@
           <w:right w:val="single" w:color="BFBFBF" w:sz="4" w:space="4"/>
         </w:pBdr>
         <w:shd w:fill="F4F4F4" w:color="auto" w:val="clear"/>
-        <w:spacing w:after="0" w:before="0" w:line="240"/>
+        <w:spacing w:after="0" w:before="0" w:line="240" w:lineRule="auto"/>
         <w:ind w:left="113" w:right="113"/>
       </w:pPr>
       <w:r>
@@ -3591,7 +3595,7 @@
           <w:right w:val="single" w:color="BFBFBF" w:sz="4" w:space="4"/>
         </w:pBdr>
         <w:shd w:fill="F4F4F4" w:color="auto" w:val="clear"/>
-        <w:spacing w:after="0" w:before="0" w:line="240"/>
+        <w:spacing w:after="0" w:before="0" w:line="240" w:lineRule="auto"/>
         <w:ind w:left="113" w:right="113"/>
       </w:pPr>
       <w:r>
@@ -3613,7 +3617,7 @@
           <w:right w:val="single" w:color="BFBFBF" w:sz="4" w:space="4"/>
         </w:pBdr>
         <w:shd w:fill="F4F4F4" w:color="auto" w:val="clear"/>
-        <w:spacing w:after="0" w:before="0" w:line="240"/>
+        <w:spacing w:after="0" w:before="0" w:line="240" w:lineRule="auto"/>
         <w:ind w:left="113" w:right="113"/>
       </w:pPr>
       <w:r>
@@ -3635,7 +3639,7 @@
           <w:right w:val="single" w:color="BFBFBF" w:sz="4" w:space="4"/>
         </w:pBdr>
         <w:shd w:fill="F4F4F4" w:color="auto" w:val="clear"/>
-        <w:spacing w:after="0" w:before="0" w:line="240"/>
+        <w:spacing w:after="0" w:before="0" w:line="240" w:lineRule="auto"/>
         <w:ind w:left="113" w:right="113"/>
       </w:pPr>
       <w:r>
@@ -3657,7 +3661,7 @@
           <w:right w:val="single" w:color="BFBFBF" w:sz="4" w:space="4"/>
         </w:pBdr>
         <w:shd w:fill="F4F4F4" w:color="auto" w:val="clear"/>
-        <w:spacing w:after="0" w:before="0" w:line="240"/>
+        <w:spacing w:after="0" w:before="0" w:line="240" w:lineRule="auto"/>
         <w:ind w:left="113" w:right="113"/>
       </w:pPr>
       <w:r>
@@ -3679,7 +3683,7 @@
           <w:right w:val="single" w:color="BFBFBF" w:sz="4" w:space="4"/>
         </w:pBdr>
         <w:shd w:fill="F4F4F4" w:color="auto" w:val="clear"/>
-        <w:spacing w:after="0" w:before="0" w:line="240"/>
+        <w:spacing w:after="0" w:before="0" w:line="240" w:lineRule="auto"/>
         <w:ind w:left="113" w:right="113"/>
       </w:pPr>
       <w:r>
@@ -3701,7 +3705,7 @@
           <w:right w:val="single" w:color="BFBFBF" w:sz="4" w:space="4"/>
         </w:pBdr>
         <w:shd w:fill="F4F4F4" w:color="auto" w:val="clear"/>
-        <w:spacing w:after="0" w:before="0" w:line="240"/>
+        <w:spacing w:after="0" w:before="0" w:line="240" w:lineRule="auto"/>
         <w:ind w:left="113" w:right="113"/>
       </w:pPr>
       <w:r>
@@ -3723,7 +3727,7 @@
           <w:right w:val="single" w:color="BFBFBF" w:sz="4" w:space="4"/>
         </w:pBdr>
         <w:shd w:fill="F4F4F4" w:color="auto" w:val="clear"/>
-        <w:spacing w:after="0" w:before="0" w:line="240"/>
+        <w:spacing w:after="0" w:before="0" w:line="240" w:lineRule="auto"/>
         <w:ind w:left="113" w:right="113"/>
       </w:pPr>
       <w:r>
@@ -3745,7 +3749,7 @@
           <w:right w:val="single" w:color="BFBFBF" w:sz="4" w:space="4"/>
         </w:pBdr>
         <w:shd w:fill="F4F4F4" w:color="auto" w:val="clear"/>
-        <w:spacing w:after="0" w:before="0" w:line="240"/>
+        <w:spacing w:after="0" w:before="0" w:line="240" w:lineRule="auto"/>
         <w:ind w:left="113" w:right="113"/>
       </w:pPr>
       <w:r>
@@ -3767,7 +3771,7 @@
           <w:right w:val="single" w:color="BFBFBF" w:sz="4" w:space="4"/>
         </w:pBdr>
         <w:shd w:fill="F4F4F4" w:color="auto" w:val="clear"/>
-        <w:spacing w:after="0" w:before="0" w:line="240"/>
+        <w:spacing w:after="0" w:before="0" w:line="240" w:lineRule="auto"/>
         <w:ind w:left="113" w:right="113"/>
       </w:pPr>
       <w:r>
@@ -3789,7 +3793,7 @@
           <w:right w:val="single" w:color="BFBFBF" w:sz="4" w:space="4"/>
         </w:pBdr>
         <w:shd w:fill="F4F4F4" w:color="auto" w:val="clear"/>
-        <w:spacing w:after="0" w:before="0" w:line="240"/>
+        <w:spacing w:after="0" w:before="0" w:line="240" w:lineRule="auto"/>
         <w:ind w:left="113" w:right="113"/>
       </w:pPr>
       <w:r>
@@ -3811,7 +3815,7 @@
           <w:right w:val="single" w:color="BFBFBF" w:sz="4" w:space="4"/>
         </w:pBdr>
         <w:shd w:fill="F4F4F4" w:color="auto" w:val="clear"/>
-        <w:spacing w:after="0" w:before="0" w:line="240"/>
+        <w:spacing w:after="0" w:before="0" w:line="240" w:lineRule="auto"/>
         <w:ind w:left="113" w:right="113"/>
       </w:pPr>
       <w:r>
@@ -3833,7 +3837,7 @@
           <w:right w:val="single" w:color="BFBFBF" w:sz="4" w:space="4"/>
         </w:pBdr>
         <w:shd w:fill="F4F4F4" w:color="auto" w:val="clear"/>
-        <w:spacing w:after="160" w:before="0" w:line="240"/>
+        <w:spacing w:after="160" w:before="0" w:line="240" w:lineRule="auto"/>
         <w:ind w:left="113" w:right="113"/>
       </w:pPr>
       <w:r>
@@ -3847,7 +3851,8 @@
     </w:p>
     <w:p>
       <w:pPr>
-        <w:spacing w:after="80"/>
+        <w:keepNext w:val="false"/>
+        <w:spacing w:after="80" w:before="0"/>
         <w:ind w:firstLine="709"/>
         <w:jc w:val="both"/>
       </w:pPr>
@@ -3879,7 +3884,8 @@
     </w:p>
     <w:p>
       <w:pPr>
-        <w:spacing w:after="80"/>
+        <w:keepNext w:val="false"/>
+        <w:spacing w:after="80" w:before="0"/>
         <w:ind w:firstLine="709"/>
         <w:jc w:val="both"/>
       </w:pPr>
@@ -3928,7 +3934,8 @@
     </w:p>
     <w:p>
       <w:pPr>
-        <w:spacing w:after="80"/>
+        <w:keepNext w:val="false"/>
+        <w:spacing w:after="80" w:before="0"/>
         <w:ind w:firstLine="709"/>
         <w:jc w:val="both"/>
       </w:pPr>
@@ -3950,7 +3957,7 @@
           <w:right w:val="single" w:color="BFBFBF" w:sz="4" w:space="4"/>
         </w:pBdr>
         <w:shd w:fill="F4F4F4" w:color="auto" w:val="clear"/>
-        <w:spacing w:after="160" w:before="60" w:line="240"/>
+        <w:spacing w:after="160" w:before="60" w:line="240" w:lineRule="auto"/>
         <w:ind w:left="113" w:right="113"/>
       </w:pPr>
       <w:r>
@@ -3964,7 +3971,8 @@
     </w:p>
     <w:p>
       <w:pPr>
-        <w:spacing w:after="80"/>
+        <w:keepNext w:val="false"/>
+        <w:spacing w:after="80" w:before="0"/>
         <w:ind w:firstLine="709"/>
         <w:jc w:val="both"/>
       </w:pPr>
@@ -3986,7 +3994,7 @@
           <w:right w:val="single" w:color="BFBFBF" w:sz="4" w:space="4"/>
         </w:pBdr>
         <w:shd w:fill="F4F4F4" w:color="auto" w:val="clear"/>
-        <w:spacing w:after="0" w:before="60" w:line="240"/>
+        <w:spacing w:after="0" w:before="60" w:line="240" w:lineRule="auto"/>
         <w:ind w:left="113" w:right="113"/>
       </w:pPr>
       <w:r>
@@ -4008,7 +4016,7 @@
           <w:right w:val="single" w:color="BFBFBF" w:sz="4" w:space="4"/>
         </w:pBdr>
         <w:shd w:fill="F4F4F4" w:color="auto" w:val="clear"/>
-        <w:spacing w:after="0" w:before="0" w:line="240"/>
+        <w:spacing w:after="0" w:before="0" w:line="240" w:lineRule="auto"/>
         <w:ind w:left="113" w:right="113"/>
       </w:pPr>
       <w:r>
@@ -4030,7 +4038,7 @@
           <w:right w:val="single" w:color="BFBFBF" w:sz="4" w:space="4"/>
         </w:pBdr>
         <w:shd w:fill="F4F4F4" w:color="auto" w:val="clear"/>
-        <w:spacing w:after="0" w:before="0" w:line="240"/>
+        <w:spacing w:after="0" w:before="0" w:line="240" w:lineRule="auto"/>
         <w:ind w:left="113" w:right="113"/>
       </w:pPr>
       <w:r>
@@ -4052,7 +4060,7 @@
           <w:right w:val="single" w:color="BFBFBF" w:sz="4" w:space="4"/>
         </w:pBdr>
         <w:shd w:fill="F4F4F4" w:color="auto" w:val="clear"/>
-        <w:spacing w:after="0" w:before="0" w:line="240"/>
+        <w:spacing w:after="0" w:before="0" w:line="240" w:lineRule="auto"/>
         <w:ind w:left="113" w:right="113"/>
       </w:pPr>
       <w:r>
@@ -4074,7 +4082,7 @@
           <w:right w:val="single" w:color="BFBFBF" w:sz="4" w:space="4"/>
         </w:pBdr>
         <w:shd w:fill="F4F4F4" w:color="auto" w:val="clear"/>
-        <w:spacing w:after="0" w:before="0" w:line="240"/>
+        <w:spacing w:after="0" w:before="0" w:line="240" w:lineRule="auto"/>
         <w:ind w:left="113" w:right="113"/>
       </w:pPr>
       <w:r>
@@ -4096,7 +4104,7 @@
           <w:right w:val="single" w:color="BFBFBF" w:sz="4" w:space="4"/>
         </w:pBdr>
         <w:shd w:fill="F4F4F4" w:color="auto" w:val="clear"/>
-        <w:spacing w:after="0" w:before="0" w:line="240"/>
+        <w:spacing w:after="0" w:before="0" w:line="240" w:lineRule="auto"/>
         <w:ind w:left="113" w:right="113"/>
       </w:pPr>
       <w:r>
@@ -4118,7 +4126,7 @@
           <w:right w:val="single" w:color="BFBFBF" w:sz="4" w:space="4"/>
         </w:pBdr>
         <w:shd w:fill="F4F4F4" w:color="auto" w:val="clear"/>
-        <w:spacing w:after="160" w:before="0" w:line="240"/>
+        <w:spacing w:after="160" w:before="0" w:line="240" w:lineRule="auto"/>
         <w:ind w:left="113" w:right="113"/>
       </w:pPr>
       <w:r>
@@ -4132,7 +4140,8 @@
     </w:p>
     <w:p>
       <w:pPr>
-        <w:spacing w:after="80"/>
+        <w:keepNext w:val="false"/>
+        <w:spacing w:after="80" w:before="0"/>
         <w:ind w:firstLine="709"/>
         <w:jc w:val="both"/>
       </w:pPr>
@@ -4175,7 +4184,8 @@
     </w:p>
     <w:p>
       <w:pPr>
-        <w:spacing w:after="80"/>
+        <w:keepNext w:val="false"/>
+        <w:spacing w:after="80" w:before="0"/>
         <w:ind w:firstLine="709"/>
         <w:jc w:val="both"/>
       </w:pPr>
@@ -4232,7 +4242,7 @@
           <w:right w:val="single" w:color="BFBFBF" w:sz="4" w:space="4"/>
         </w:pBdr>
         <w:shd w:fill="F4F4F4" w:color="auto" w:val="clear"/>
-        <w:spacing w:after="0" w:before="60" w:line="240"/>
+        <w:spacing w:after="0" w:before="60" w:line="240" w:lineRule="auto"/>
         <w:ind w:left="113" w:right="113"/>
       </w:pPr>
       <w:r>
@@ -4254,7 +4264,7 @@
           <w:right w:val="single" w:color="BFBFBF" w:sz="4" w:space="4"/>
         </w:pBdr>
         <w:shd w:fill="F4F4F4" w:color="auto" w:val="clear"/>
-        <w:spacing w:after="0" w:before="0" w:line="240"/>
+        <w:spacing w:after="0" w:before="0" w:line="240" w:lineRule="auto"/>
         <w:ind w:left="113" w:right="113"/>
       </w:pPr>
       <w:r>
@@ -4276,7 +4286,7 @@
           <w:right w:val="single" w:color="BFBFBF" w:sz="4" w:space="4"/>
         </w:pBdr>
         <w:shd w:fill="F4F4F4" w:color="auto" w:val="clear"/>
-        <w:spacing w:after="0" w:before="0" w:line="240"/>
+        <w:spacing w:after="0" w:before="0" w:line="240" w:lineRule="auto"/>
         <w:ind w:left="113" w:right="113"/>
       </w:pPr>
       <w:r>
@@ -4298,7 +4308,7 @@
           <w:right w:val="single" w:color="BFBFBF" w:sz="4" w:space="4"/>
         </w:pBdr>
         <w:shd w:fill="F4F4F4" w:color="auto" w:val="clear"/>
-        <w:spacing w:after="0" w:before="0" w:line="240"/>
+        <w:spacing w:after="0" w:before="0" w:line="240" w:lineRule="auto"/>
         <w:ind w:left="113" w:right="113"/>
       </w:pPr>
       <w:r>
@@ -4320,7 +4330,7 @@
           <w:right w:val="single" w:color="BFBFBF" w:sz="4" w:space="4"/>
         </w:pBdr>
         <w:shd w:fill="F4F4F4" w:color="auto" w:val="clear"/>
-        <w:spacing w:after="0" w:before="0" w:line="240"/>
+        <w:spacing w:after="0" w:before="0" w:line="240" w:lineRule="auto"/>
         <w:ind w:left="113" w:right="113"/>
       </w:pPr>
       <w:r>
@@ -4342,7 +4352,7 @@
           <w:right w:val="single" w:color="BFBFBF" w:sz="4" w:space="4"/>
         </w:pBdr>
         <w:shd w:fill="F4F4F4" w:color="auto" w:val="clear"/>
-        <w:spacing w:after="0" w:before="0" w:line="240"/>
+        <w:spacing w:after="0" w:before="0" w:line="240" w:lineRule="auto"/>
         <w:ind w:left="113" w:right="113"/>
       </w:pPr>
       <w:r>
@@ -4364,7 +4374,7 @@
           <w:right w:val="single" w:color="BFBFBF" w:sz="4" w:space="4"/>
         </w:pBdr>
         <w:shd w:fill="F4F4F4" w:color="auto" w:val="clear"/>
-        <w:spacing w:after="0" w:before="0" w:line="240"/>
+        <w:spacing w:after="0" w:before="0" w:line="240" w:lineRule="auto"/>
         <w:ind w:left="113" w:right="113"/>
       </w:pPr>
       <w:r>
@@ -4386,7 +4396,7 @@
           <w:right w:val="single" w:color="BFBFBF" w:sz="4" w:space="4"/>
         </w:pBdr>
         <w:shd w:fill="F4F4F4" w:color="auto" w:val="clear"/>
-        <w:spacing w:after="0" w:before="0" w:line="240"/>
+        <w:spacing w:after="0" w:before="0" w:line="240" w:lineRule="auto"/>
         <w:ind w:left="113" w:right="113"/>
       </w:pPr>
       <w:r>
@@ -4408,7 +4418,7 @@
           <w:right w:val="single" w:color="BFBFBF" w:sz="4" w:space="4"/>
         </w:pBdr>
         <w:shd w:fill="F4F4F4" w:color="auto" w:val="clear"/>
-        <w:spacing w:after="160" w:before="0" w:line="240"/>
+        <w:spacing w:after="160" w:before="0" w:line="240" w:lineRule="auto"/>
         <w:ind w:left="113" w:right="113"/>
       </w:pPr>
       <w:r>
@@ -4430,7 +4440,7 @@
           <w:right w:val="single" w:color="A9C4A0" w:sz="4" w:space="4"/>
         </w:pBdr>
         <w:shd w:fill="F1F7EE" w:color="auto" w:val="clear"/>
-        <w:spacing w:after="0" w:before="60" w:line="240"/>
+        <w:spacing w:after="0" w:before="60" w:line="240" w:lineRule="auto"/>
         <w:ind w:left="113" w:right="113"/>
       </w:pPr>
       <w:r>
@@ -4452,7 +4462,7 @@
           <w:right w:val="single" w:color="A9C4A0" w:sz="4" w:space="4"/>
         </w:pBdr>
         <w:shd w:fill="F1F7EE" w:color="auto" w:val="clear"/>
-        <w:spacing w:after="0" w:before="0" w:line="240"/>
+        <w:spacing w:after="0" w:before="0" w:line="240" w:lineRule="auto"/>
         <w:ind w:left="113" w:right="113"/>
       </w:pPr>
       <w:r>
@@ -4474,7 +4484,7 @@
           <w:right w:val="single" w:color="A9C4A0" w:sz="4" w:space="4"/>
         </w:pBdr>
         <w:shd w:fill="F1F7EE" w:color="auto" w:val="clear"/>
-        <w:spacing w:after="0" w:before="0" w:line="240"/>
+        <w:spacing w:after="0" w:before="0" w:line="240" w:lineRule="auto"/>
         <w:ind w:left="113" w:right="113"/>
       </w:pPr>
       <w:r>
@@ -4496,7 +4506,7 @@
           <w:right w:val="single" w:color="A9C4A0" w:sz="4" w:space="4"/>
         </w:pBdr>
         <w:shd w:fill="F1F7EE" w:color="auto" w:val="clear"/>
-        <w:spacing w:after="0" w:before="0" w:line="240"/>
+        <w:spacing w:after="0" w:before="0" w:line="240" w:lineRule="auto"/>
         <w:ind w:left="113" w:right="113"/>
       </w:pPr>
       <w:r>
@@ -4518,7 +4528,7 @@
           <w:right w:val="single" w:color="A9C4A0" w:sz="4" w:space="4"/>
         </w:pBdr>
         <w:shd w:fill="F1F7EE" w:color="auto" w:val="clear"/>
-        <w:spacing w:after="0" w:before="0" w:line="240"/>
+        <w:spacing w:after="0" w:before="0" w:line="240" w:lineRule="auto"/>
         <w:ind w:left="113" w:right="113"/>
       </w:pPr>
       <w:r>
@@ -4540,7 +4550,7 @@
           <w:right w:val="single" w:color="A9C4A0" w:sz="4" w:space="4"/>
         </w:pBdr>
         <w:shd w:fill="F1F7EE" w:color="auto" w:val="clear"/>
-        <w:spacing w:after="0" w:before="0" w:line="240"/>
+        <w:spacing w:after="0" w:before="0" w:line="240" w:lineRule="auto"/>
         <w:ind w:left="113" w:right="113"/>
       </w:pPr>
       <w:r>
@@ -4562,7 +4572,7 @@
           <w:right w:val="single" w:color="A9C4A0" w:sz="4" w:space="4"/>
         </w:pBdr>
         <w:shd w:fill="F1F7EE" w:color="auto" w:val="clear"/>
-        <w:spacing w:after="0" w:before="0" w:line="240"/>
+        <w:spacing w:after="0" w:before="0" w:line="240" w:lineRule="auto"/>
         <w:ind w:left="113" w:right="113"/>
       </w:pPr>
       <w:r>
@@ -4584,7 +4594,7 @@
           <w:right w:val="single" w:color="A9C4A0" w:sz="4" w:space="4"/>
         </w:pBdr>
         <w:shd w:fill="F1F7EE" w:color="auto" w:val="clear"/>
-        <w:spacing w:after="160" w:before="0" w:line="240"/>
+        <w:spacing w:after="160" w:before="0" w:line="240" w:lineRule="auto"/>
         <w:ind w:left="113" w:right="113"/>
       </w:pPr>
       <w:r>
@@ -4616,7 +4626,7 @@
           <w:right w:val="single" w:color="BFBFBF" w:sz="4" w:space="4"/>
         </w:pBdr>
         <w:shd w:fill="F4F4F4" w:color="auto" w:val="clear"/>
-        <w:spacing w:after="0" w:before="60" w:line="240"/>
+        <w:spacing w:after="0" w:before="60" w:line="240" w:lineRule="auto"/>
         <w:ind w:left="113" w:right="113"/>
       </w:pPr>
       <w:r>
@@ -4638,7 +4648,7 @@
           <w:right w:val="single" w:color="BFBFBF" w:sz="4" w:space="4"/>
         </w:pBdr>
         <w:shd w:fill="F4F4F4" w:color="auto" w:val="clear"/>
-        <w:spacing w:after="0" w:before="0" w:line="240"/>
+        <w:spacing w:after="0" w:before="0" w:line="240" w:lineRule="auto"/>
         <w:ind w:left="113" w:right="113"/>
       </w:pPr>
       <w:r>
@@ -4660,7 +4670,7 @@
           <w:right w:val="single" w:color="BFBFBF" w:sz="4" w:space="4"/>
         </w:pBdr>
         <w:shd w:fill="F4F4F4" w:color="auto" w:val="clear"/>
-        <w:spacing w:after="0" w:before="0" w:line="240"/>
+        <w:spacing w:after="0" w:before="0" w:line="240" w:lineRule="auto"/>
         <w:ind w:left="113" w:right="113"/>
       </w:pPr>
       <w:r>
@@ -4682,7 +4692,7 @@
           <w:right w:val="single" w:color="BFBFBF" w:sz="4" w:space="4"/>
         </w:pBdr>
         <w:shd w:fill="F4F4F4" w:color="auto" w:val="clear"/>
-        <w:spacing w:after="0" w:before="0" w:line="240"/>
+        <w:spacing w:after="0" w:before="0" w:line="240" w:lineRule="auto"/>
         <w:ind w:left="113" w:right="113"/>
       </w:pPr>
       <w:r>
@@ -4704,7 +4714,7 @@
           <w:right w:val="single" w:color="BFBFBF" w:sz="4" w:space="4"/>
         </w:pBdr>
         <w:shd w:fill="F4F4F4" w:color="auto" w:val="clear"/>
-        <w:spacing w:after="0" w:before="0" w:line="240"/>
+        <w:spacing w:after="0" w:before="0" w:line="240" w:lineRule="auto"/>
         <w:ind w:left="113" w:right="113"/>
       </w:pPr>
       <w:r>
@@ -4726,7 +4736,7 @@
           <w:right w:val="single" w:color="BFBFBF" w:sz="4" w:space="4"/>
         </w:pBdr>
         <w:shd w:fill="F4F4F4" w:color="auto" w:val="clear"/>
-        <w:spacing w:after="0" w:before="0" w:line="240"/>
+        <w:spacing w:after="0" w:before="0" w:line="240" w:lineRule="auto"/>
         <w:ind w:left="113" w:right="113"/>
       </w:pPr>
       <w:r>
@@ -4748,7 +4758,7 @@
           <w:right w:val="single" w:color="BFBFBF" w:sz="4" w:space="4"/>
         </w:pBdr>
         <w:shd w:fill="F4F4F4" w:color="auto" w:val="clear"/>
-        <w:spacing w:after="0" w:before="0" w:line="240"/>
+        <w:spacing w:after="0" w:before="0" w:line="240" w:lineRule="auto"/>
         <w:ind w:left="113" w:right="113"/>
       </w:pPr>
       <w:r>
@@ -4770,7 +4780,7 @@
           <w:right w:val="single" w:color="BFBFBF" w:sz="4" w:space="4"/>
         </w:pBdr>
         <w:shd w:fill="F4F4F4" w:color="auto" w:val="clear"/>
-        <w:spacing w:after="160" w:before="0" w:line="240"/>
+        <w:spacing w:after="160" w:before="0" w:line="240" w:lineRule="auto"/>
         <w:ind w:left="113" w:right="113"/>
       </w:pPr>
       <w:r>
@@ -4784,7 +4794,8 @@
     </w:p>
     <w:p>
       <w:pPr>
-        <w:spacing w:after="80"/>
+        <w:keepNext w:val="false"/>
+        <w:spacing w:after="80" w:before="0"/>
         <w:ind w:firstLine="709"/>
         <w:jc w:val="both"/>
       </w:pPr>
@@ -4827,7 +4838,8 @@
     </w:p>
     <w:p>
       <w:pPr>
-        <w:spacing w:after="80"/>
+        <w:keepNext w:val="false"/>
+        <w:spacing w:after="80" w:before="0"/>
         <w:ind w:firstLine="709"/>
         <w:jc w:val="both"/>
       </w:pPr>
@@ -5093,6 +5105,18 @@
     </w:lvl>
   </w:abstractNum>
   <w:abstractNum w:abstractNumId="3" w15:restartNumberingAfterBreak="0">
+    <w:multiLevelType w:val="hybridMultilevel"/>
+    <w:lvl w:ilvl="0" w15:tentative="1">
+      <w:start w:val="1"/>
+      <w:numFmt w:val="bullet"/>
+      <w:lvlText w:val="•"/>
+      <w:lvlJc w:val="left"/>
+      <w:pPr>
+        <w:ind w:left="1134" w:hanging="284"/>
+      </w:pPr>
+    </w:lvl>
+  </w:abstractNum>
+  <w:abstractNum w:abstractNumId="4" w15:restartNumberingAfterBreak="0">
     <w:multiLevelType w:val="hybridMultilevel"/>
     <w:lvl w:ilvl="0" w15:tentative="1">
       <w:start w:val="1"/>

</xml_diff>